<commit_message>
Refine lab 6 report and diagram layouts
Co-authored-by: Jakub Trojanowski <kubatrojanowski538-create@users.noreply.github.com>
</commit_message>
<xml_diff>
--- a/inzynieria/cwiczenie_6_diagramy/sprawozdanie_cwiczenie_6.docx
+++ b/inzynieria/cwiczenie_6_diagramy/sprawozdanie_cwiczenie_6.docx
@@ -9,7 +9,7 @@
       <w:r>
         <w:rPr>
           <w:b/>
-          <w:sz w:val="36"/>
+          <w:sz w:val="34"/>
         </w:rPr>
         <w:t>Ćwiczenie 6</w:t>
         <w:br/>
@@ -33,13 +33,43 @@
       </w:r>
     </w:p>
     <w:p>
+      <w:pPr>
+        <w:pStyle w:val="Heading1"/>
+      </w:pPr>
       <w:r>
-        <w:t>Cel: przygotowanie diagramów FHD oraz DFD dla systemu obsługi zamówień na podstawie wstępnego ERD z instrukcji.</w:t>
+        <w:t>Polecenia do ćwiczenia</w:t>
       </w:r>
     </w:p>
     <w:p>
+      <w:pPr>
+        <w:pStyle w:val="ListNumber"/>
+      </w:pPr>
       <w:r>
-        <w:t>Zakres: funkcje główne, dekompozycja funkcji Klient/Rejon/Magazyn oraz diagramy przepływu danych: kontekstowy, systemowy i trzy szczegółowe.</w:t>
+        <w:t>Na podstawie zamieszczonego w instrukcji wstępnego diagramu ERD dla systemu obsługi zamówień zaproponować przykładowy diagram hierarchii funkcji (FHD) dla minimum 5 głównych podfunkcji. Do stworzenia diagramów wykorzystać narzędzie UMLet.</w:t>
+      </w:r>
+    </w:p>
+    <w:p>
+      <w:pPr>
+        <w:pStyle w:val="ListNumber"/>
+      </w:pPr>
+      <w:r>
+        <w:t>Dokonać dekompozycji funkcji głównych odpowiadających za encje: Magazyn, Rejon, Klient.</w:t>
+      </w:r>
+    </w:p>
+    <w:p>
+      <w:pPr>
+        <w:pStyle w:val="ListNumber"/>
+      </w:pPr>
+      <w:r>
+        <w:t>Na podstawie stworzonych diagramów hierarchii funkcji stworzyć diagramy przepływu danych z pomocą Data Modeler: diagram kontekstowy dla systemu Obsługi zamówień, diagram systemowy dla wszystkich głównych funkcji oraz trzy diagramy szczegółowe dla wybranych procesów głównych.</w:t>
+      </w:r>
+    </w:p>
+    <w:p>
+      <w:pPr>
+        <w:pStyle w:val="ListNumber"/>
+      </w:pPr>
+      <w:r>
+        <w:t>Przygotować raport zawierający tytuł ćwiczenia, autora, treść zadania, diagramy FHD oraz diagramy DFD.</w:t>
       </w:r>
     </w:p>
     <w:p>
@@ -52,6 +82,14 @@
         <w:pStyle w:val="Heading1"/>
       </w:pPr>
       <w:r>
+        <w:t>Diagramy</w:t>
+      </w:r>
+    </w:p>
+    <w:p>
+      <w:pPr>
+        <w:pStyle w:val="Heading2"/>
+      </w:pPr>
+      <w:r>
         <w:t>1. Diagram FHD - funkcje główne</w:t>
       </w:r>
     </w:p>
@@ -62,7 +100,7 @@
       <w:r>
         <w:drawing>
           <wp:inline xmlns:a="http://schemas.openxmlformats.org/drawingml/2006/main" xmlns:pic="http://schemas.openxmlformats.org/drawingml/2006/picture">
-            <wp:extent cx="9540000" cy="1909744"/>
+            <wp:extent cx="5940000" cy="4932059"/>
             <wp:docPr id="1" name="Picture 1"/>
             <wp:cNvGraphicFramePr>
               <a:graphicFrameLocks noChangeAspect="1"/>
@@ -83,7 +121,7 @@
                   <pic:spPr>
                     <a:xfrm>
                       <a:off x="0" y="0"/>
-                      <a:ext cx="9540000" cy="1909744"/>
+                      <a:ext cx="5940000" cy="4932059"/>
                     </a:xfrm>
                     <a:prstGeom prst="rect"/>
                   </pic:spPr>
@@ -113,7 +151,7 @@
     </w:p>
     <w:p>
       <w:pPr>
-        <w:pStyle w:val="Heading1"/>
+        <w:pStyle w:val="Heading2"/>
       </w:pPr>
       <w:r>
         <w:t>2. Diagram FHD - dekompozycja funkcji Klient, Rejon i Magazyn</w:t>
@@ -126,7 +164,7 @@
       <w:r>
         <w:drawing>
           <wp:inline xmlns:a="http://schemas.openxmlformats.org/drawingml/2006/main" xmlns:pic="http://schemas.openxmlformats.org/drawingml/2006/picture">
-            <wp:extent cx="9540000" cy="704448"/>
+            <wp:extent cx="5940000" cy="6431210"/>
             <wp:docPr id="2" name="Picture 2"/>
             <wp:cNvGraphicFramePr>
               <a:graphicFrameLocks noChangeAspect="1"/>
@@ -147,7 +185,7 @@
                   <pic:spPr>
                     <a:xfrm>
                       <a:off x="0" y="0"/>
-                      <a:ext cx="9540000" cy="704448"/>
+                      <a:ext cx="5940000" cy="6431210"/>
                     </a:xfrm>
                     <a:prstGeom prst="rect"/>
                   </pic:spPr>
@@ -177,7 +215,7 @@
     </w:p>
     <w:p>
       <w:pPr>
-        <w:pStyle w:val="Heading1"/>
+        <w:pStyle w:val="Heading2"/>
       </w:pPr>
       <w:r>
         <w:t>3. DFD - diagram kontekstowy</w:t>
@@ -190,7 +228,7 @@
       <w:r>
         <w:drawing>
           <wp:inline xmlns:a="http://schemas.openxmlformats.org/drawingml/2006/main" xmlns:pic="http://schemas.openxmlformats.org/drawingml/2006/picture">
-            <wp:extent cx="9540000" cy="4304140"/>
+            <wp:extent cx="5940000" cy="2742994"/>
             <wp:docPr id="3" name="Picture 3"/>
             <wp:cNvGraphicFramePr>
               <a:graphicFrameLocks noChangeAspect="1"/>
@@ -211,7 +249,7 @@
                   <pic:spPr>
                     <a:xfrm>
                       <a:off x="0" y="0"/>
-                      <a:ext cx="9540000" cy="4304140"/>
+                      <a:ext cx="5940000" cy="2742994"/>
                     </a:xfrm>
                     <a:prstGeom prst="rect"/>
                   </pic:spPr>
@@ -241,7 +279,7 @@
     </w:p>
     <w:p>
       <w:pPr>
-        <w:pStyle w:val="Heading1"/>
+        <w:pStyle w:val="Heading2"/>
       </w:pPr>
       <w:r>
         <w:t>4. DFD - diagram systemowy</w:t>
@@ -254,7 +292,7 @@
       <w:r>
         <w:drawing>
           <wp:inline xmlns:a="http://schemas.openxmlformats.org/drawingml/2006/main" xmlns:pic="http://schemas.openxmlformats.org/drawingml/2006/picture">
-            <wp:extent cx="9540000" cy="4299429"/>
+            <wp:extent cx="5940000" cy="3087343"/>
             <wp:docPr id="4" name="Picture 4"/>
             <wp:cNvGraphicFramePr>
               <a:graphicFrameLocks noChangeAspect="1"/>
@@ -275,7 +313,7 @@
                   <pic:spPr>
                     <a:xfrm>
                       <a:off x="0" y="0"/>
-                      <a:ext cx="9540000" cy="4299429"/>
+                      <a:ext cx="5940000" cy="3087343"/>
                     </a:xfrm>
                     <a:prstGeom prst="rect"/>
                   </pic:spPr>
@@ -305,7 +343,7 @@
     </w:p>
     <w:p>
       <w:pPr>
-        <w:pStyle w:val="Heading1"/>
+        <w:pStyle w:val="Heading2"/>
       </w:pPr>
       <w:r>
         <w:t>5. DFD szczegółowy - Obsługa klientów</w:t>
@@ -318,7 +356,7 @@
       <w:r>
         <w:drawing>
           <wp:inline xmlns:a="http://schemas.openxmlformats.org/drawingml/2006/main" xmlns:pic="http://schemas.openxmlformats.org/drawingml/2006/picture">
-            <wp:extent cx="9540000" cy="1640346"/>
+            <wp:extent cx="3886935" cy="7200000"/>
             <wp:docPr id="5" name="Picture 5"/>
             <wp:cNvGraphicFramePr>
               <a:graphicFrameLocks noChangeAspect="1"/>
@@ -339,7 +377,7 @@
                   <pic:spPr>
                     <a:xfrm>
                       <a:off x="0" y="0"/>
-                      <a:ext cx="9540000" cy="1640346"/>
+                      <a:ext cx="3886935" cy="7200000"/>
                     </a:xfrm>
                     <a:prstGeom prst="rect"/>
                   </pic:spPr>
@@ -369,7 +407,7 @@
     </w:p>
     <w:p>
       <w:pPr>
-        <w:pStyle w:val="Heading1"/>
+        <w:pStyle w:val="Heading2"/>
       </w:pPr>
       <w:r>
         <w:t>6. DFD szczegółowy - Obsługa rejonów</w:t>
@@ -382,7 +420,7 @@
       <w:r>
         <w:drawing>
           <wp:inline xmlns:a="http://schemas.openxmlformats.org/drawingml/2006/main" xmlns:pic="http://schemas.openxmlformats.org/drawingml/2006/picture">
-            <wp:extent cx="9540000" cy="2521442"/>
+            <wp:extent cx="5940000" cy="6086946"/>
             <wp:docPr id="6" name="Picture 6"/>
             <wp:cNvGraphicFramePr>
               <a:graphicFrameLocks noChangeAspect="1"/>
@@ -403,7 +441,7 @@
                   <pic:spPr>
                     <a:xfrm>
                       <a:off x="0" y="0"/>
-                      <a:ext cx="9540000" cy="2521442"/>
+                      <a:ext cx="5940000" cy="6086946"/>
                     </a:xfrm>
                     <a:prstGeom prst="rect"/>
                   </pic:spPr>
@@ -433,7 +471,7 @@
     </w:p>
     <w:p>
       <w:pPr>
-        <w:pStyle w:val="Heading1"/>
+        <w:pStyle w:val="Heading2"/>
       </w:pPr>
       <w:r>
         <w:t>7. DFD szczegółowy - Obsługa magazynu</w:t>
@@ -446,7 +484,7 @@
       <w:r>
         <w:drawing>
           <wp:inline xmlns:a="http://schemas.openxmlformats.org/drawingml/2006/main" xmlns:pic="http://schemas.openxmlformats.org/drawingml/2006/picture">
-            <wp:extent cx="9540000" cy="2088853"/>
+            <wp:extent cx="5627524" cy="7200000"/>
             <wp:docPr id="7" name="Picture 7"/>
             <wp:cNvGraphicFramePr>
               <a:graphicFrameLocks noChangeAspect="1"/>
@@ -467,7 +505,7 @@
                   <pic:spPr>
                     <a:xfrm>
                       <a:off x="0" y="0"/>
-                      <a:ext cx="9540000" cy="2088853"/>
+                      <a:ext cx="5627524" cy="7200000"/>
                     </a:xfrm>
                     <a:prstGeom prst="rect"/>
                   </pic:spPr>
@@ -491,8 +529,8 @@
       </w:r>
     </w:p>
     <w:sectPr>
-      <w:pgSz w:w="16838" w:h="11906" w:orient="landscape"/>
-      <w:pgMar w:top="680" w:right="680" w:bottom="680" w:left="680" w:header="720" w:footer="720" w:gutter="0"/>
+      <w:pgSz w:w="11906" w:h="16838"/>
+      <w:pgMar w:top="794" w:right="794" w:bottom="794" w:left="794" w:header="720" w:footer="720" w:gutter="0"/>
       <w:cols w:space="720"/>
       <w:docGrid w:linePitch="360"/>
     </w:sectPr>
@@ -951,11 +989,11 @@
       <w:outlineLvl w:val="1"/>
     </w:pPr>
     <w:rPr>
-      <w:rFonts w:asciiTheme="majorHAnsi" w:eastAsiaTheme="majorEastAsia" w:hAnsiTheme="majorHAnsi" w:cstheme="majorBidi"/>
+      <w:rFonts w:asciiTheme="majorHAnsi" w:eastAsiaTheme="majorEastAsia" w:hAnsiTheme="majorHAnsi" w:cstheme="majorBidi" w:ascii="Arial" w:hAnsi="Arial"/>
       <w:b/>
       <w:bCs/>
       <w:color w:val="4F81BD" w:themeColor="accent1"/>
-      <w:sz w:val="26"/>
+      <w:sz w:val="22"/>
       <w:szCs w:val="26"/>
     </w:rPr>
   </w:style>
@@ -1216,11 +1254,11 @@
       <w:contextualSpacing/>
     </w:pPr>
     <w:rPr>
-      <w:rFonts w:asciiTheme="majorHAnsi" w:eastAsiaTheme="majorEastAsia" w:hAnsiTheme="majorHAnsi" w:cstheme="majorBidi" w:ascii="Arial" w:hAnsi="Arial"/>
+      <w:rFonts w:asciiTheme="majorHAnsi" w:eastAsiaTheme="majorEastAsia" w:hAnsiTheme="majorHAnsi" w:cstheme="majorBidi"/>
       <w:color w:val="17365D" w:themeColor="text2" w:themeShade="BF"/>
       <w:spacing w:val="5"/>
       <w:kern w:val="28"/>
-      <w:sz w:val="36"/>
+      <w:sz w:val="52"/>
       <w:szCs w:val="52"/>
     </w:rPr>
   </w:style>

</xml_diff>